<commit_message>
feat: sync Oct 2026 report updates and upgrade contact/support modal pipeline
</commit_message>
<xml_diff>
--- a/PFP_Platform/web/public/docs/minab-report/PFPJ_Minab_Master_Factual_Determination_Report.docx
+++ b/PFP_Platform/web/public/docs/minab-report/PFPJ_Minab_Master_Factual_Determination_Report.docx
@@ -77,7 +77,7 @@
                 <w:color w:val="64748B"/>
                 <w:sz w:val="16"/>
               </w:rPr>
-              <w:t>Production Date: 2026-10-11 · Status: Working Draft (Pre-Filing Review Edition) · Helsinki, Finland</w:t>
+              <w:t>Production Date: 2026-10-18 · Status: Working Draft (Pre-Filing Review Edition) · Helsinki, Finland</w:t>
             </w:r>
           </w:p>
         </w:tc>
@@ -453,137 +453,6 @@
           <w:sz w:val="19"/>
         </w:rPr>
         <w:t xml:space="preserve"> OFFICIAL EXPERT DETERMINATION DOSSIER (Canonical Judicial Edition — September 2026)</w:t>
-      </w:r>
-    </w:p>
-    <w:p>
-      <w:pPr>
-        <w:spacing w:before="80" w:after="80"/>
-        <w:jc w:val="center"/>
-      </w:pPr>
-      <w:r>
-        <w:rPr>
-          <w:color w:val="CBD5E1"/>
-        </w:rPr>
-        <w:t>————————————————————————————————</w:t>
-      </w:r>
-    </w:p>
-    <w:p>
-      <w:pPr>
-        <w:spacing w:before="80" w:after="120"/>
-        <w:ind w:left="432"/>
-      </w:pPr>
-      <w:r>
-        <w:rPr>
-          <w:rFonts w:ascii="Calibri" w:hAnsi="Calibri"/>
-          <w:i/>
-          <w:color w:val="334155"/>
-          <w:sz w:val="19"/>
-        </w:rPr>
-        <w:t xml:space="preserve">🌐 </w:t>
-      </w:r>
-      <w:r>
-        <w:rPr>
-          <w:rFonts w:ascii="Calibri" w:hAnsi="Calibri"/>
-          <w:b/>
-          <w:i/>
-          <w:color w:val="334155"/>
-          <w:sz w:val="19"/>
-        </w:rPr>
-        <w:t>Interactive Online Reader:</w:t>
-      </w:r>
-      <w:r>
-        <w:rPr>
-          <w:rFonts w:ascii="Calibri" w:hAnsi="Calibri"/>
-          <w:i/>
-          <w:color w:val="334155"/>
-          <w:sz w:val="19"/>
-        </w:rPr>
-        <w:t xml:space="preserve"> </w:t>
-      </w:r>
-      <w:r>
-        <w:rPr>
-          <w:rFonts w:ascii="Calibri" w:hAnsi="Calibri"/>
-          <w:i/>
-          <w:color w:val="2563EB"/>
-          <w:sz w:val="19"/>
-          <w:u w:val="single"/>
-        </w:rPr>
-        <w:t>https://peopleforpeace.live/draft.html</w:t>
-      </w:r>
-      <w:r>
-        <w:rPr>
-          <w:rFonts w:ascii="Calibri" w:hAnsi="Calibri"/>
-          <w:i/>
-          <w:color w:val="334155"/>
-          <w:sz w:val="19"/>
-        </w:rPr>
-        <w:t xml:space="preserve"> 📄 </w:t>
-      </w:r>
-      <w:r>
-        <w:rPr>
-          <w:rFonts w:ascii="Calibri" w:hAnsi="Calibri"/>
-          <w:b/>
-          <w:i/>
-          <w:color w:val="334155"/>
-          <w:sz w:val="19"/>
-        </w:rPr>
-        <w:t>Standalone Court Reader:</w:t>
-      </w:r>
-      <w:r>
-        <w:rPr>
-          <w:rFonts w:ascii="Calibri" w:hAnsi="Calibri"/>
-          <w:i/>
-          <w:color w:val="334155"/>
-          <w:sz w:val="19"/>
-        </w:rPr>
-        <w:t xml:space="preserve"> Open </w:t>
-      </w:r>
-      <w:r>
-        <w:rPr>
-          <w:rFonts w:ascii="Consolas" w:hAnsi="Consolas"/>
-          <w:i/>
-          <w:color w:val="831843"/>
-          <w:sz w:val="18"/>
-        </w:rPr>
-        <w:t>PFP_Platform/web/public/draft.html</w:t>
-      </w:r>
-      <w:r>
-        <w:rPr>
-          <w:rFonts w:ascii="Calibri" w:hAnsi="Calibri"/>
-          <w:i/>
-          <w:color w:val="334155"/>
-          <w:sz w:val="19"/>
-        </w:rPr>
-        <w:t xml:space="preserve"> in your browser 💻 </w:t>
-      </w:r>
-      <w:r>
-        <w:rPr>
-          <w:rFonts w:ascii="Calibri" w:hAnsi="Calibri"/>
-          <w:b/>
-          <w:i/>
-          <w:color w:val="334155"/>
-          <w:sz w:val="19"/>
-        </w:rPr>
-        <w:t>GitHub Master Docket:</w:t>
-      </w:r>
-      <w:r>
-        <w:rPr>
-          <w:rFonts w:ascii="Calibri" w:hAnsi="Calibri"/>
-          <w:i/>
-          <w:color w:val="334155"/>
-          <w:sz w:val="19"/>
-        </w:rPr>
-        <w:t xml:space="preserve"> </w:t>
-      </w:r>
-      <w:r>
-        <w:rPr>
-          <w:rFonts w:ascii="Calibri" w:hAnsi="Calibri"/>
-          <w:i/>
-          <w:color w:val="2563EB"/>
-          <w:sz w:val="19"/>
-          <w:u w:val="single"/>
-        </w:rPr>
-        <w:t>FACTUAL_DETERMINATION_AND_COMPLAINT_MASTER.md</w:t>
       </w:r>
     </w:p>
     <w:p>
@@ -5232,11 +5101,11 @@
             <w:r>
               <w:rPr>
                 <w:rFonts w:ascii="Calibri" w:hAnsi="Calibri"/>
-                <w:b/>
-                <w:color w:val="1E293B"/>
+                <w:color w:val="2563EB"/>
                 <w:sz w:val="17"/>
+                <w:u w:val="single"/>
               </w:rPr>
-              <w:t>EXH-SAT-001</w:t>
+              <w:t>**EXH-SAT-001**</w:t>
             </w:r>
           </w:p>
         </w:tc>
@@ -5328,11 +5197,11 @@
             <w:r>
               <w:rPr>
                 <w:rFonts w:ascii="Calibri" w:hAnsi="Calibri"/>
-                <w:b/>
-                <w:color w:val="1E293B"/>
+                <w:color w:val="2563EB"/>
                 <w:sz w:val="17"/>
+                <w:u w:val="single"/>
               </w:rPr>
-              <w:t>EXH-MUN-002</w:t>
+              <w:t>**EXH-MUN-002**</w:t>
             </w:r>
           </w:p>
         </w:tc>
@@ -5424,11 +5293,11 @@
             <w:r>
               <w:rPr>
                 <w:rFonts w:ascii="Calibri" w:hAnsi="Calibri"/>
-                <w:b/>
-                <w:color w:val="1E293B"/>
+                <w:color w:val="2563EB"/>
                 <w:sz w:val="17"/>
+                <w:u w:val="single"/>
               </w:rPr>
-              <w:t>EXH-LAUNCH-003</w:t>
+              <w:t>**EXH-LAUNCH-003**</w:t>
             </w:r>
           </w:p>
         </w:tc>
@@ -5520,11 +5389,11 @@
             <w:r>
               <w:rPr>
                 <w:rFonts w:ascii="Calibri" w:hAnsi="Calibri"/>
-                <w:b/>
-                <w:color w:val="1E293B"/>
+                <w:color w:val="2563EB"/>
                 <w:sz w:val="17"/>
+                <w:u w:val="single"/>
               </w:rPr>
-              <w:t>EXH-CENTCOM-004</w:t>
+              <w:t>**EXH-CENTCOM-004**</w:t>
             </w:r>
           </w:p>
         </w:tc>
@@ -5616,11 +5485,11 @@
             <w:r>
               <w:rPr>
                 <w:rFonts w:ascii="Calibri" w:hAnsi="Calibri"/>
-                <w:b/>
-                <w:color w:val="1E293B"/>
+                <w:color w:val="2563EB"/>
                 <w:sz w:val="17"/>
+                <w:u w:val="single"/>
               </w:rPr>
-              <w:t>EXH-VIC-005</w:t>
+              <w:t>**EXH-VIC-005**</w:t>
             </w:r>
           </w:p>
         </w:tc>
@@ -5729,11 +5598,11 @@
             <w:r>
               <w:rPr>
                 <w:rFonts w:ascii="Calibri" w:hAnsi="Calibri"/>
-                <w:b/>
-                <w:color w:val="1E293B"/>
+                <w:color w:val="2563EB"/>
                 <w:sz w:val="17"/>
+                <w:u w:val="single"/>
               </w:rPr>
-              <w:t>EXH-OSINT-006</w:t>
+              <w:t>**EXH-OSINT-006**</w:t>
             </w:r>
           </w:p>
         </w:tc>
@@ -5825,11 +5694,11 @@
             <w:r>
               <w:rPr>
                 <w:rFonts w:ascii="Calibri" w:hAnsi="Calibri"/>
-                <w:b/>
-                <w:color w:val="1E293B"/>
+                <w:color w:val="2563EB"/>
                 <w:sz w:val="17"/>
+                <w:u w:val="single"/>
               </w:rPr>
-              <w:t>EXH-UN-008</w:t>
+              <w:t>**EXH-UN-008**</w:t>
             </w:r>
           </w:p>
         </w:tc>
@@ -7748,7 +7617,24 @@
           <w:color w:val="1E293B"/>
           <w:sz w:val="19"/>
         </w:rPr>
-        <w:t>Historical geospatial imagery dated between October 14, 2013, and November 22, 2015 (EXH-SAT-001.1), indicates that prior to 2016 the parcel formed part of the peripheral administrative buffer zone of an Islamic Revolutionary Guard Corps (IRGC) Naval Logistics Base. During that period, no continuous masonry barrier separated the structure from the northern naval compound, and unpaved interior tracks connected the parcel to military storage depots.</w:t>
+        <w:t>Historical geospatial imagery dated between October 14, 2013, and November 22, 2015 (</w:t>
+      </w:r>
+      <w:r>
+        <w:rPr>
+          <w:rFonts w:ascii="Calibri" w:hAnsi="Calibri"/>
+          <w:color w:val="2563EB"/>
+          <w:sz w:val="19"/>
+          <w:u w:val="single"/>
+        </w:rPr>
+        <w:t>EXH-SAT-001.1</w:t>
+      </w:r>
+      <w:r>
+        <w:rPr>
+          <w:rFonts w:ascii="Calibri" w:hAnsi="Calibri"/>
+          <w:color w:val="1E293B"/>
+          <w:sz w:val="19"/>
+        </w:rPr>
+        <w:t>), indicates that prior to 2016 the parcel formed part of the peripheral administrative buffer zone of an Islamic Revolutionary Guard Corps (IRGC) Naval Logistics Base. During that period, no continuous masonry barrier separated the structure from the northern naval compound, and unpaved interior tracks connected the parcel to military storage depots.</w:t>
       </w:r>
     </w:p>
     <w:p>
@@ -7769,7 +7655,24 @@
           <w:color w:val="1E293B"/>
           <w:sz w:val="19"/>
         </w:rPr>
-        <w:t>However, official cadastral registries and verified multi-spectral satellite imagery acquired by Planet Labs and Maxar WorldView-3 between February 12 and August 28, 2016 (EXH-SAT-001.2), confirm that the parcel underwent a permanent physical and legal transformation:</w:t>
+        <w:t>However, official cadastral registries and verified multi-spectral satellite imagery acquired by Planet Labs and Maxar WorldView-3 between February 12 and August 28, 2016 (</w:t>
+      </w:r>
+      <w:r>
+        <w:rPr>
+          <w:rFonts w:ascii="Calibri" w:hAnsi="Calibri"/>
+          <w:color w:val="2563EB"/>
+          <w:sz w:val="19"/>
+          <w:u w:val="single"/>
+        </w:rPr>
+        <w:t>EXH-SAT-001.2</w:t>
+      </w:r>
+      <w:r>
+        <w:rPr>
+          <w:rFonts w:ascii="Calibri" w:hAnsi="Calibri"/>
+          <w:color w:val="1E293B"/>
+          <w:sz w:val="19"/>
+        </w:rPr>
+        <w:t>), confirm that the parcel underwent a permanent physical and legal transformation:</w:t>
       </w:r>
     </w:p>
     <w:p>
@@ -7891,7 +7794,24 @@
           <w:color w:val="1E293B"/>
           <w:sz w:val="19"/>
         </w:rPr>
-        <w:t xml:space="preserve"> (EXH-VIC-005.3).</w:t>
+        <w:t xml:space="preserve"> (</w:t>
+      </w:r>
+      <w:r>
+        <w:rPr>
+          <w:rFonts w:ascii="Calibri" w:hAnsi="Calibri"/>
+          <w:color w:val="2563EB"/>
+          <w:sz w:val="19"/>
+          <w:u w:val="single"/>
+        </w:rPr>
+        <w:t>EXH-VIC-005.3</w:t>
+      </w:r>
+      <w:r>
+        <w:rPr>
+          <w:rFonts w:ascii="Calibri" w:hAnsi="Calibri"/>
+          <w:color w:val="1E293B"/>
+          <w:sz w:val="19"/>
+        </w:rPr>
+        <w:t>).</w:t>
       </w:r>
     </w:p>
     <w:p>
@@ -7912,7 +7832,24 @@
           <w:color w:val="1E293B"/>
           <w:sz w:val="19"/>
         </w:rPr>
-        <w:t xml:space="preserve">Sub-meter GIS vector analysis (EXH-SAT-001.4) demonstrates that the school's central classroom wing stood 18.4 meters south of the 2.8-meter concrete partition wall, and </w:t>
+        <w:t>Sub-meter GIS vector analysis (</w:t>
+      </w:r>
+      <w:r>
+        <w:rPr>
+          <w:rFonts w:ascii="Calibri" w:hAnsi="Calibri"/>
+          <w:color w:val="2563EB"/>
+          <w:sz w:val="19"/>
+          <w:u w:val="single"/>
+        </w:rPr>
+        <w:t>EXH-SAT-001.4</w:t>
+      </w:r>
+      <w:r>
+        <w:rPr>
+          <w:rFonts w:ascii="Calibri" w:hAnsi="Calibri"/>
+          <w:color w:val="1E293B"/>
+          <w:sz w:val="19"/>
+        </w:rPr>
+        <w:t xml:space="preserve">) demonstrates that the school's central classroom wing stood 18.4 meters south of the 2.8-meter concrete partition wall, and </w:t>
       </w:r>
       <w:r>
         <w:rPr>
@@ -7958,7 +7895,24 @@
           <w:color w:val="1E293B"/>
           <w:sz w:val="20"/>
         </w:rPr>
-        <w:t>43 bis. Systematic review of 142 distinct high-resolution commercial satellite passes collected between September 2016 and February 2026 (EXH-SAT-001.3) establishes the complete absence of military activity within the school perimeter over the decade preceding the strike. Zero military vehicles, defensive fortifications, armaments, weapon emplacements, communications antennas, or uniformed personnel were detected within the walled school compound. Conversely, optical imagery captured during daytime overflights consistently documented established patterns of civilian life, including regular clusters of child pedestrians, student assembly formations in the courtyard, and civilian passenger transport vehicles congregated outside the western gate.</w:t>
+        <w:t>43 bis. Systematic review of 142 distinct high-resolution commercial satellite passes collected between September 2016 and February 2026 (</w:t>
+      </w:r>
+      <w:r>
+        <w:rPr>
+          <w:rFonts w:ascii="Calibri" w:hAnsi="Calibri"/>
+          <w:color w:val="2563EB"/>
+          <w:sz w:val="20"/>
+          <w:u w:val="single"/>
+        </w:rPr>
+        <w:t>EXH-SAT-001.3</w:t>
+      </w:r>
+      <w:r>
+        <w:rPr>
+          <w:rFonts w:ascii="Calibri" w:hAnsi="Calibri"/>
+          <w:color w:val="1E293B"/>
+          <w:sz w:val="20"/>
+        </w:rPr>
+        <w:t>) establishes the complete absence of military activity within the school perimeter over the decade preceding the strike. Zero military vehicles, defensive fortifications, armaments, weapon emplacements, communications antennas, or uniformed personnel were detected within the walled school compound. Conversely, optical imagery captured during daytime overflights consistently documented established patterns of civilian life, including regular clusters of child pedestrians, student assembly formations in the courtyard, and civilian passenger transport vehicles congregated outside the western gate.</w:t>
       </w:r>
     </w:p>
     <w:p>
@@ -8180,7 +8134,41 @@
           <w:color w:val="1E293B"/>
           <w:sz w:val="19"/>
         </w:rPr>
-        <w:t xml:space="preserve"> (EXH-MUN-002.5), verified audiovisual recordings, and forensic engineering surveys (EXH-SAT-001.5), unfolded as follows:</w:t>
+        <w:t xml:space="preserve"> (</w:t>
+      </w:r>
+      <w:r>
+        <w:rPr>
+          <w:rFonts w:ascii="Calibri" w:hAnsi="Calibri"/>
+          <w:color w:val="2563EB"/>
+          <w:sz w:val="19"/>
+          <w:u w:val="single"/>
+        </w:rPr>
+        <w:t>EXH-MUN-002.5</w:t>
+      </w:r>
+      <w:r>
+        <w:rPr>
+          <w:rFonts w:ascii="Calibri" w:hAnsi="Calibri"/>
+          <w:color w:val="1E293B"/>
+          <w:sz w:val="19"/>
+        </w:rPr>
+        <w:t>), verified audiovisual recordings, and forensic engineering surveys (</w:t>
+      </w:r>
+      <w:r>
+        <w:rPr>
+          <w:rFonts w:ascii="Calibri" w:hAnsi="Calibri"/>
+          <w:color w:val="2563EB"/>
+          <w:sz w:val="19"/>
+          <w:u w:val="single"/>
+        </w:rPr>
+        <w:t>EXH-SAT-001.5</w:t>
+      </w:r>
+      <w:r>
+        <w:rPr>
+          <w:rFonts w:ascii="Calibri" w:hAnsi="Calibri"/>
+          <w:color w:val="1E293B"/>
+          <w:sz w:val="19"/>
+        </w:rPr>
+        <w:t>), unfolded as follows:</w:t>
       </w:r>
     </w:p>
     <w:p>
@@ -8359,7 +8347,24 @@
           <w:color w:val="1E293B"/>
           <w:sz w:val="19"/>
         </w:rPr>
-        <w:t>Following the strike, the United States Department of Defense and United States Central Command (CENTCOM) issued official statements addressing the incident (EXH-CENTCOM-004.1):</w:t>
+        <w:t>Following the strike, the United States Department of Defense and United States Central Command (CENTCOM) issued official statements addressing the incident (</w:t>
+      </w:r>
+      <w:r>
+        <w:rPr>
+          <w:rFonts w:ascii="Calibri" w:hAnsi="Calibri"/>
+          <w:color w:val="2563EB"/>
+          <w:sz w:val="19"/>
+          <w:u w:val="single"/>
+        </w:rPr>
+        <w:t>EXH-CENTCOM-004.1</w:t>
+      </w:r>
+      <w:r>
+        <w:rPr>
+          <w:rFonts w:ascii="Calibri" w:hAnsi="Calibri"/>
+          <w:color w:val="1E293B"/>
+          <w:sz w:val="19"/>
+        </w:rPr>
+        <w:t>):</w:t>
       </w:r>
     </w:p>
     <w:p>
@@ -8416,7 +8421,24 @@
           <w:color w:val="1E293B"/>
           <w:sz w:val="19"/>
         </w:rPr>
-        <w:t xml:space="preserve"> Leaked findings of the internal military investigation commissioned under Army Regulation 15-6 (EXH-CENTCOM-004.2) and investigative reporting (</w:t>
+        <w:t xml:space="preserve"> Leaked findings of the internal military investigation commissioned under Army Regulation 15-6 (</w:t>
+      </w:r>
+      <w:r>
+        <w:rPr>
+          <w:rFonts w:ascii="Calibri" w:hAnsi="Calibri"/>
+          <w:color w:val="2563EB"/>
+          <w:sz w:val="19"/>
+          <w:u w:val="single"/>
+        </w:rPr>
+        <w:t>EXH-CENTCOM-004.2</w:t>
+      </w:r>
+      <w:r>
+        <w:rPr>
+          <w:rFonts w:ascii="Calibri" w:hAnsi="Calibri"/>
+          <w:color w:val="1E293B"/>
+          <w:sz w:val="19"/>
+        </w:rPr>
+        <w:t>) and investigative reporting (</w:t>
       </w:r>
       <w:r>
         <w:rPr>
@@ -8762,7 +8784,58 @@
           <w:color w:val="1E293B"/>
           <w:sz w:val="20"/>
         </w:rPr>
-        <w:t>, EXH-VIC-005.1), hospital triage manifests (EXH-VIC-005.2), and certified Ministry of Education personnel records (EXH-VIC-005.3) establish the definitive casualty toll:</w:t>
+        <w:t xml:space="preserve">, </w:t>
+      </w:r>
+      <w:r>
+        <w:rPr>
+          <w:rFonts w:ascii="Calibri" w:hAnsi="Calibri"/>
+          <w:color w:val="2563EB"/>
+          <w:sz w:val="20"/>
+          <w:u w:val="single"/>
+        </w:rPr>
+        <w:t>EXH-VIC-005.1</w:t>
+      </w:r>
+      <w:r>
+        <w:rPr>
+          <w:rFonts w:ascii="Calibri" w:hAnsi="Calibri"/>
+          <w:color w:val="1E293B"/>
+          <w:sz w:val="20"/>
+        </w:rPr>
+        <w:t>), hospital triage manifests (</w:t>
+      </w:r>
+      <w:r>
+        <w:rPr>
+          <w:rFonts w:ascii="Calibri" w:hAnsi="Calibri"/>
+          <w:color w:val="2563EB"/>
+          <w:sz w:val="20"/>
+          <w:u w:val="single"/>
+        </w:rPr>
+        <w:t>EXH-VIC-005.2</w:t>
+      </w:r>
+      <w:r>
+        <w:rPr>
+          <w:rFonts w:ascii="Calibri" w:hAnsi="Calibri"/>
+          <w:color w:val="1E293B"/>
+          <w:sz w:val="20"/>
+        </w:rPr>
+        <w:t>), and certified Ministry of Education personnel records (</w:t>
+      </w:r>
+      <w:r>
+        <w:rPr>
+          <w:rFonts w:ascii="Calibri" w:hAnsi="Calibri"/>
+          <w:color w:val="2563EB"/>
+          <w:sz w:val="20"/>
+          <w:u w:val="single"/>
+        </w:rPr>
+        <w:t>EXH-VIC-005.3</w:t>
+      </w:r>
+      <w:r>
+        <w:rPr>
+          <w:rFonts w:ascii="Calibri" w:hAnsi="Calibri"/>
+          <w:color w:val="1E293B"/>
+          <w:sz w:val="20"/>
+        </w:rPr>
+        <w:t>) establish the definitive casualty toll:</w:t>
       </w:r>
     </w:p>
     <w:p>
@@ -9672,7 +9745,24 @@
           <w:color w:val="1E293B"/>
           <w:sz w:val="19"/>
         </w:rPr>
-        <w:t>Physical debris recovered from the impact crater and schoolyard (EXH-MUN-002) was examined by certified ordnance forensics specialists.</w:t>
+        <w:t>Physical debris recovered from the impact crater and schoolyard (</w:t>
+      </w:r>
+      <w:r>
+        <w:rPr>
+          <w:rFonts w:ascii="Calibri" w:hAnsi="Calibri"/>
+          <w:color w:val="2563EB"/>
+          <w:sz w:val="19"/>
+          <w:u w:val="single"/>
+        </w:rPr>
+        <w:t>EXH-MUN-002</w:t>
+      </w:r>
+      <w:r>
+        <w:rPr>
+          <w:rFonts w:ascii="Calibri" w:hAnsi="Calibri"/>
+          <w:color w:val="1E293B"/>
+          <w:sz w:val="19"/>
+        </w:rPr>
+        <w:t>) was examined by certified ordnance forensics specialists.</w:t>
       </w:r>
     </w:p>
     <w:p>
@@ -9959,7 +10049,24 @@
           <w:color w:val="1E293B"/>
           <w:sz w:val="19"/>
         </w:rPr>
-        <w:t>Regional air defense radar ingress vectors and naval tracking data (EXH-LAUNCH-003) establish that the cruise missiles flew at low altitude (30–50 meters AGL) following an ingress route from the Gulf of Oman.</w:t>
+        <w:t>Regional air defense radar ingress vectors and naval tracking data (</w:t>
+      </w:r>
+      <w:r>
+        <w:rPr>
+          <w:rFonts w:ascii="Calibri" w:hAnsi="Calibri"/>
+          <w:color w:val="2563EB"/>
+          <w:sz w:val="19"/>
+          <w:u w:val="single"/>
+        </w:rPr>
+        <w:t>EXH-LAUNCH-003</w:t>
+      </w:r>
+      <w:r>
+        <w:rPr>
+          <w:rFonts w:ascii="Calibri" w:hAnsi="Calibri"/>
+          <w:color w:val="1E293B"/>
+          <w:sz w:val="19"/>
+        </w:rPr>
+        <w:t>) establish that the cruise missiles flew at low altitude (30–50 meters AGL) following an ingress route from the Gulf of Oman.</w:t>
       </w:r>
     </w:p>
     <w:p>
@@ -13530,7 +13637,7 @@
           <w:color w:val="1E293B"/>
           <w:sz w:val="19"/>
         </w:rPr>
-        <w:t xml:space="preserve"> Victims and their next-of-kin must be granted formal procedural status and access to proceedings.  </w:t>
+        <w:t xml:space="preserve"> Victims and their next-of-kin must be granted formal procedural status and access to proceedings.</w:t>
       </w:r>
     </w:p>
     <w:p>
@@ -14223,7 +14330,41 @@
           <w:color w:val="1E293B"/>
           <w:sz w:val="19"/>
         </w:rPr>
-        <w:t>(i) That the verified master evidentiary archives (EXH-SAT-001 through EXH-UN-008) remain deposited in permanent, tamper-evident custody in Helsinki, Finland, under the Berkeley Protocol;</w:t>
+        <w:t>(i) That the verified master evidentiary archives (</w:t>
+      </w:r>
+      <w:r>
+        <w:rPr>
+          <w:rFonts w:ascii="Calibri" w:hAnsi="Calibri"/>
+          <w:color w:val="2563EB"/>
+          <w:sz w:val="19"/>
+          <w:u w:val="single"/>
+        </w:rPr>
+        <w:t>EXH-SAT-001</w:t>
+      </w:r>
+      <w:r>
+        <w:rPr>
+          <w:rFonts w:ascii="Calibri" w:hAnsi="Calibri"/>
+          <w:color w:val="1E293B"/>
+          <w:sz w:val="19"/>
+        </w:rPr>
+        <w:t xml:space="preserve"> through </w:t>
+      </w:r>
+      <w:r>
+        <w:rPr>
+          <w:rFonts w:ascii="Calibri" w:hAnsi="Calibri"/>
+          <w:color w:val="2563EB"/>
+          <w:sz w:val="19"/>
+          <w:u w:val="single"/>
+        </w:rPr>
+        <w:t>EXH-UN-008</w:t>
+      </w:r>
+      <w:r>
+        <w:rPr>
+          <w:rFonts w:ascii="Calibri" w:hAnsi="Calibri"/>
+          <w:color w:val="1E293B"/>
+          <w:sz w:val="19"/>
+        </w:rPr>
+        <w:t>) remain deposited in permanent, tamper-evident custody in Helsinki, Finland, under the Berkeley Protocol;</w:t>
       </w:r>
     </w:p>
     <w:p>
@@ -14562,7 +14703,7 @@
         <w:color w:val="64748B"/>
         <w:sz w:val="16"/>
       </w:rPr>
-      <w:t>CONFIDENTIAL · PEOPLE FOR PEACE &amp; JUSTICE RY · DOCKET PFPJ-2026-IR-001 · DRAFT DATE: 2026-10-11</w:t>
+      <w:t>CONFIDENTIAL · PEOPLE FOR PEACE &amp; JUSTICE RY · DOCKET PFPJ-2026-IR-001 · DRAFT DATE: 2026-10-18</w:t>
     </w:r>
   </w:p>
 </w:ftr>

</xml_diff>